<commit_message>
Actualizar normativa en compartido/normativa con Reglas_1.md, Reglas_1.docx, Reglas_2.md, Reglas_3.md; refactorizar generador con constantes IUTECP, imagenes data-driven y textos configurables; actualizar contenidos reales de Juliano y Amaal; limpiar archivos residuales
</commit_message>
<xml_diff>
--- a/amaal/cronogramas/Cronograma_Administracion_Semana10_IUTECP.docx
+++ b/amaal/cronogramas/Cronograma_Administracion_Semana10_IUTECP.docx
@@ -133,7 +133,7 @@
           <w:rFonts w:ascii="Times New Roman" w:hAnsi="Times New Roman"/>
           <w:sz w:val="24"/>
         </w:rPr>
-        <w:t>Amaal [Apellido] |  C.I.: [Cédula]</w:t>
+        <w:t>Alrifaaie Amaal |  C.I.: 31.985.792</w:t>
       </w:r>
     </w:p>
     <w:p/>
@@ -838,7 +838,7 @@
               </w:rPr>
               <w:t>Firma del Pasante:</w:t>
               <w:br/>
-              <w:t>Amaal [Apellido] |  C.I.: [Cédula]</w:t>
+              <w:t>Alrifaaie Amaal |  C.I.: 31.985.792</w:t>
             </w:r>
           </w:p>
         </w:tc>

</xml_diff>

<commit_message>
Agregar firmas y sello a cronogramas de Amaal
</commit_message>
<xml_diff>
--- a/amaal/cronogramas/Cronograma_Administracion_Semana10_IUTECP.docx
+++ b/amaal/cronogramas/Cronograma_Administracion_Semana10_IUTECP.docx
@@ -874,42 +874,90 @@
         <w:tc>
           <w:tcPr>
             <w:tcW w:type="dxa" w:w="4133"/>
-            <w:vAlign w:val="center"/>
           </w:tcPr>
           <w:p>
             <w:pPr>
-              <w:spacing w:line="240" w:lineRule="auto" w:before="80" w:after="80"/>
               <w:jc w:val="center"/>
             </w:pPr>
             <w:r/>
             <w:r>
-              <w:rPr>
-                <w:rFonts w:ascii="Times New Roman" w:hAnsi="Times New Roman"/>
-                <w:b w:val="0"/>
-                <w:sz w:val="24"/>
-              </w:rPr>
-              <w:t>_________________________</w:t>
+              <w:drawing>
+                <wp:inline xmlns:a="http://schemas.openxmlformats.org/drawingml/2006/main" xmlns:pic="http://schemas.openxmlformats.org/drawingml/2006/picture">
+                  <wp:extent cx="1260000" cy="641739"/>
+                  <wp:docPr id="1" name="Picture 1"/>
+                  <wp:cNvGraphicFramePr>
+                    <a:graphicFrameLocks noChangeAspect="1"/>
+                  </wp:cNvGraphicFramePr>
+                  <a:graphic>
+                    <a:graphicData uri="http://schemas.openxmlformats.org/drawingml/2006/picture">
+                      <pic:pic>
+                        <pic:nvPicPr>
+                          <pic:cNvPr id="0" name="firma_amaal.png"/>
+                          <pic:cNvPicPr/>
+                        </pic:nvPicPr>
+                        <pic:blipFill>
+                          <a:blip r:embed="rId9"/>
+                          <a:stretch>
+                            <a:fillRect/>
+                          </a:stretch>
+                        </pic:blipFill>
+                        <pic:spPr>
+                          <a:xfrm>
+                            <a:off x="0" y="0"/>
+                            <a:ext cx="1260000" cy="641739"/>
+                          </a:xfrm>
+                          <a:prstGeom prst="rect"/>
+                        </pic:spPr>
+                      </pic:pic>
+                    </a:graphicData>
+                  </a:graphic>
+                </wp:inline>
+              </w:drawing>
             </w:r>
           </w:p>
         </w:tc>
         <w:tc>
           <w:tcPr>
             <w:tcW w:type="dxa" w:w="4139"/>
-            <w:vAlign w:val="center"/>
           </w:tcPr>
           <w:p>
             <w:pPr>
-              <w:spacing w:line="240" w:lineRule="auto" w:before="80" w:after="80"/>
               <w:jc w:val="center"/>
             </w:pPr>
             <w:r/>
             <w:r>
-              <w:rPr>
-                <w:rFonts w:ascii="Times New Roman" w:hAnsi="Times New Roman"/>
-                <w:b w:val="0"/>
-                <w:sz w:val="24"/>
-              </w:rPr>
-              <w:t>_________________________</w:t>
+              <w:drawing>
+                <wp:inline xmlns:a="http://schemas.openxmlformats.org/drawingml/2006/main" xmlns:pic="http://schemas.openxmlformats.org/drawingml/2006/picture">
+                  <wp:extent cx="1260000" cy="493427"/>
+                  <wp:docPr id="2" name="Picture 2"/>
+                  <wp:cNvGraphicFramePr>
+                    <a:graphicFrameLocks noChangeAspect="1"/>
+                  </wp:cNvGraphicFramePr>
+                  <a:graphic>
+                    <a:graphicData uri="http://schemas.openxmlformats.org/drawingml/2006/picture">
+                      <pic:pic>
+                        <pic:nvPicPr>
+                          <pic:cNvPr id="0" name="firma_tutor_amaal.png"/>
+                          <pic:cNvPicPr/>
+                        </pic:nvPicPr>
+                        <pic:blipFill>
+                          <a:blip r:embed="rId10"/>
+                          <a:stretch>
+                            <a:fillRect/>
+                          </a:stretch>
+                        </pic:blipFill>
+                        <pic:spPr>
+                          <a:xfrm>
+                            <a:off x="0" y="0"/>
+                            <a:ext cx="1260000" cy="493427"/>
+                          </a:xfrm>
+                          <a:prstGeom prst="rect"/>
+                        </pic:spPr>
+                      </pic:pic>
+                    </a:graphicData>
+                  </a:graphic>
+                </wp:inline>
+              </w:drawing>
             </w:r>
           </w:p>
         </w:tc>
@@ -970,12 +1018,38 @@
         <w:jc w:val="center"/>
       </w:pPr>
       <w:r>
-        <w:rPr>
-          <w:rFonts w:ascii="Times New Roman" w:hAnsi="Times New Roman"/>
-          <w:b/>
-          <w:sz w:val="20"/>
-        </w:rPr>
-        <w:t>SELLO DE LA EMPRESA</w:t>
+        <w:drawing>
+          <wp:inline xmlns:a="http://schemas.openxmlformats.org/drawingml/2006/main" xmlns:pic="http://schemas.openxmlformats.org/drawingml/2006/picture">
+            <wp:extent cx="1440000" cy="587203"/>
+            <wp:docPr id="3" name="Picture 3"/>
+            <wp:cNvGraphicFramePr>
+              <a:graphicFrameLocks noChangeAspect="1"/>
+            </wp:cNvGraphicFramePr>
+            <a:graphic>
+              <a:graphicData uri="http://schemas.openxmlformats.org/drawingml/2006/picture">
+                <pic:pic>
+                  <pic:nvPicPr>
+                    <pic:cNvPr id="0" name="sello_amaal.png"/>
+                    <pic:cNvPicPr/>
+                  </pic:nvPicPr>
+                  <pic:blipFill>
+                    <a:blip r:embed="rId11"/>
+                    <a:stretch>
+                      <a:fillRect/>
+                    </a:stretch>
+                  </pic:blipFill>
+                  <pic:spPr>
+                    <a:xfrm>
+                      <a:off x="0" y="0"/>
+                      <a:ext cx="1440000" cy="587203"/>
+                    </a:xfrm>
+                    <a:prstGeom prst="rect"/>
+                  </pic:spPr>
+                </pic:pic>
+              </a:graphicData>
+            </a:graphic>
+          </wp:inline>
+        </w:drawing>
       </w:r>
     </w:p>
     <w:sectPr>

</xml_diff>

<commit_message>
Compilar informes, borradores y cronogramas de todos
</commit_message>
<xml_diff>
--- a/amaal/cronogramas/Cronograma_Administracion_Semana10_IUTECP.docx
+++ b/amaal/cronogramas/Cronograma_Administracion_Semana10_IUTECP.docx
@@ -181,7 +181,7 @@
           <w:b w:val="0"/>
           <w:sz w:val="24"/>
         </w:rPr>
-        <w:t>Consolidar y revisar el informe final de pasantías bajo las normas IUTECP para su presentación y firma de cierre.</w:t>
+        <w:t>Consolidar el informe final, presentar los resultados y completar los recaudos de cierre de las pasantías.</w:t>
       </w:r>
     </w:p>
     <w:p/>
@@ -363,7 +363,7 @@
                 <w:b w:val="0"/>
                 <w:sz w:val="20"/>
               </w:rPr>
-              <w:t>Unir los capítulos I, II y III, junto con las conclusiones, recomendaciones y anexos en el formato final.</w:t>
+              <w:t>Integrar capítulos, referencias y anexos en el documento definitivo.</w:t>
             </w:r>
           </w:p>
         </w:tc>
@@ -384,7 +384,7 @@
                 <w:b w:val="0"/>
                 <w:sz w:val="20"/>
               </w:rPr>
-              <w:t>PC, Word</w:t>
+              <w:t>PC, procesador de textos</w:t>
             </w:r>
           </w:p>
         </w:tc>
@@ -428,7 +428,7 @@
                 <w:b w:val="0"/>
                 <w:sz w:val="20"/>
               </w:rPr>
-              <w:t>Formateo bajo normas</w:t>
+              <w:t>Revisión normativa</w:t>
             </w:r>
           </w:p>
         </w:tc>
@@ -449,7 +449,7 @@
                 <w:b w:val="0"/>
                 <w:sz w:val="20"/>
               </w:rPr>
-              <w:t>Adecuar el espaciado, márgenes, tipo de letra e índices de acuerdo a la normativa de transcripción del IUTECP.</w:t>
+              <w:t>Verificar márgenes, interlineado, paginación, índices y referencias conforme a IUTECP.</w:t>
             </w:r>
           </w:p>
         </w:tc>
@@ -470,7 +470,7 @@
                 <w:b w:val="0"/>
                 <w:sz w:val="20"/>
               </w:rPr>
-              <w:t>Word, plantilla IUTECP</w:t>
+              <w:t>Normativa institucional</w:t>
             </w:r>
           </w:p>
         </w:tc>
@@ -514,7 +514,7 @@
                 <w:b w:val="0"/>
                 <w:sz w:val="20"/>
               </w:rPr>
-              <w:t>Revisión de ortografía</w:t>
+              <w:t>Presentación de resultados</w:t>
             </w:r>
           </w:p>
         </w:tc>
@@ -535,7 +535,7 @@
                 <w:b w:val="0"/>
                 <w:sz w:val="20"/>
               </w:rPr>
-              <w:t>Realizar la lectura final del texto para corregir la sintaxis y asegurar la coherencia técnica del documento.</w:t>
+              <w:t>Presentar el diagnóstico y la propuesta ante la supervisión del área.</w:t>
             </w:r>
           </w:p>
         </w:tc>
@@ -556,7 +556,7 @@
                 <w:b w:val="0"/>
                 <w:sz w:val="20"/>
               </w:rPr>
-              <w:t>Word, corrector ortográfico</w:t>
+              <w:t>Presentación, laptop</w:t>
             </w:r>
           </w:p>
         </w:tc>
@@ -600,7 +600,7 @@
                 <w:b w:val="0"/>
                 <w:sz w:val="20"/>
               </w:rPr>
-              <w:t>Reunión de cierre</w:t>
+              <w:t>Revisión final</w:t>
             </w:r>
           </w:p>
         </w:tc>
@@ -621,7 +621,7 @@
                 <w:b w:val="0"/>
                 <w:sz w:val="20"/>
               </w:rPr>
-              <w:t>Presentar los resultados y formatos propuestos a la Supervisora de Administración y al Tutor Industrial.</w:t>
+              <w:t>Corregir ortografía y coherencia entre objetivos, cronograma, actividades y conclusiones.</w:t>
             </w:r>
           </w:p>
         </w:tc>
@@ -642,7 +642,7 @@
                 <w:b w:val="0"/>
                 <w:sz w:val="20"/>
               </w:rPr>
-              <w:t>Presentación en PDF, laptop</w:t>
+              <w:t>Procesador de textos</w:t>
             </w:r>
           </w:p>
         </w:tc>
@@ -686,7 +686,7 @@
                 <w:b w:val="0"/>
                 <w:sz w:val="20"/>
               </w:rPr>
-              <w:t>Firma y aval</w:t>
+              <w:t>Recaudos de cierre</w:t>
             </w:r>
           </w:p>
         </w:tc>
@@ -707,7 +707,7 @@
                 <w:b w:val="0"/>
                 <w:sz w:val="20"/>
               </w:rPr>
-              <w:t>Obtener las firmas del tutor industrial y el sello de la empresa en el informe de pasantías definitivo.</w:t>
+              <w:t>Gestionar firmas, sello y documentación de culminación.</w:t>
             </w:r>
           </w:p>
         </w:tc>
@@ -728,7 +728,7 @@
                 <w:b w:val="0"/>
                 <w:sz w:val="20"/>
               </w:rPr>
-              <w:t>Documento impreso, bolígrafos, sello</w:t>
+              <w:t>Formatos institucionales</w:t>
             </w:r>
           </w:p>
         </w:tc>
@@ -759,7 +759,7 @@
           <w:b w:val="0"/>
           <w:sz w:val="24"/>
         </w:rPr>
-        <w:t>Informe final de pasantías impreso/digitalizado con firmas de aprobación y carta de culminación de actividades.</w:t>
+        <w:t>Informe final, propuesta presentada y recaudos institucionales de cierre.</w:t>
       </w:r>
     </w:p>
     <w:p/>
@@ -787,7 +787,6 @@
           <w:b w:val="0"/>
           <w:sz w:val="24"/>
         </w:rPr>
-        <w:t>La pasante Amaal culminó con éxito sus actividades de pasantía. El informe presentado cumple con los estándares requeridos y aporta soluciones aplicables a IDETEL.</w:t>
       </w:r>
     </w:p>
     <w:p>

</xml_diff>

<commit_message>
Actualizar cronogramas de Amaal y agregar presentación
</commit_message>
<xml_diff>
--- a/amaal/cronogramas/Cronograma_Administracion_Semana10_IUTECP.docx
+++ b/amaal/cronogramas/Cronograma_Administracion_Semana10_IUTECP.docx
@@ -765,6 +765,7 @@
     <w:p/>
     <w:p>
       <w:pPr>
+        <w:keepNext/>
         <w:spacing w:after="80"/>
       </w:pPr>
       <w:r>
@@ -787,67 +788,7 @@
           <w:b w:val="0"/>
           <w:sz w:val="24"/>
         </w:rPr>
-      </w:r>
-    </w:p>
-    <w:p>
-      <w:pPr>
-        <w:spacing w:line="360" w:lineRule="auto"/>
-      </w:pPr>
-      <w:r>
-        <w:rPr>
-          <w:rFonts w:ascii="Times New Roman" w:hAnsi="Times New Roman"/>
-          <w:i/>
-          <w:sz w:val="22"/>
-        </w:rPr>
-        <w:t>(Espacio reservado para la evaluación cualitativa del tutor sobre control de procesos, puntualidad, manejo de solicitudes y cumplimiento de directrices contables)</w:t>
-      </w:r>
-    </w:p>
-    <w:p>
-      <w:pPr>
-        <w:spacing w:before="160" w:after="0"/>
-      </w:pPr>
-      <w:r>
-        <w:rPr>
-          <w:rFonts w:ascii="Times New Roman" w:hAnsi="Times New Roman"/>
-          <w:b/>
-        </w:rPr>
-        <w:t>___________________________________________________________________________</w:t>
-      </w:r>
-    </w:p>
-    <w:p>
-      <w:pPr>
-        <w:spacing w:before="160" w:after="0"/>
-      </w:pPr>
-      <w:r>
-        <w:rPr>
-          <w:rFonts w:ascii="Times New Roman" w:hAnsi="Times New Roman"/>
-          <w:b/>
-        </w:rPr>
-        <w:t>___________________________________________________________________________</w:t>
-      </w:r>
-    </w:p>
-    <w:p>
-      <w:pPr>
-        <w:spacing w:before="160" w:after="0"/>
-      </w:pPr>
-      <w:r>
-        <w:rPr>
-          <w:rFonts w:ascii="Times New Roman" w:hAnsi="Times New Roman"/>
-          <w:b/>
-        </w:rPr>
-        <w:t>___________________________________________________________________________</w:t>
-      </w:r>
-    </w:p>
-    <w:p>
-      <w:pPr>
-        <w:spacing w:before="160" w:after="0"/>
-      </w:pPr>
-      <w:r>
-        <w:rPr>
-          <w:rFonts w:ascii="Times New Roman" w:hAnsi="Times New Roman"/>
-          <w:b/>
-        </w:rPr>
-        <w:t>___________________________________________________________________________</w:t>
+        <w:t>La pasante culminó satisfactoriamente su período de pasantías, demostrando responsabilidad, puntualidad, disposición para recibir orientaciones y cumplimiento de las actividades asignadas. Se evidenció un progreso favorable en el manejo de los procesos administrativos y en la formulación de propuestas de mejora.</w:t>
       </w:r>
     </w:p>
     <w:p/>

</xml_diff>

<commit_message>
chore: actualiza informes, anexos y presentaciones
</commit_message>
<xml_diff>
--- a/amaal/cronogramas/Cronograma_Administracion_Semana10_IUTECP.docx
+++ b/amaal/cronogramas/Cronograma_Administracion_Semana10_IUTECP.docx
@@ -153,7 +153,7 @@
           <w:rFonts w:ascii="Times New Roman" w:hAnsi="Times New Roman"/>
           <w:sz w:val="24"/>
         </w:rPr>
-        <w:t>Lenny Mata  |  C.I.: 8969750</w:t>
+        <w:t>Lic. Lenny Mata  |  C.I.: 8969750</w:t>
       </w:r>
     </w:p>
     <w:p/>
@@ -734,7 +734,27 @@
         </w:tc>
       </w:tr>
     </w:tbl>
-    <w:p/>
+    <w:p>
+      <w:pPr>
+        <w:spacing w:line="240" w:lineRule="auto" w:before="0" w:after="120"/>
+        <w:ind w:firstLine="0"/>
+      </w:pPr>
+      <w:r>
+        <w:rPr>
+          <w:rFonts w:ascii="Times New Roman" w:hAnsi="Times New Roman"/>
+          <w:i/>
+          <w:sz w:val="20"/>
+        </w:rPr>
+        <w:t xml:space="preserve">Fuente: </w:t>
+      </w:r>
+      <w:r>
+        <w:rPr>
+          <w:rFonts w:ascii="Times New Roman" w:hAnsi="Times New Roman"/>
+          <w:sz w:val="20"/>
+        </w:rPr>
+        <w:t>Alrifaai A. (2026).</w:t>
+      </w:r>
+    </w:p>
     <w:p>
       <w:pPr>
         <w:spacing w:after="80"/>
@@ -945,7 +965,7 @@
               </w:rPr>
               <w:t>Firma del Tutor Industrial:</w:t>
               <w:br/>
-              <w:t>Lenny Mata  |  C.I.: 8969750</w:t>
+              <w:t>Lic. Lenny Mata  |  C.I.: 8969750</w:t>
             </w:r>
           </w:p>
         </w:tc>

</xml_diff>

<commit_message>
Homologar informes y publicar anexos finales
</commit_message>
<xml_diff>
--- a/amaal/cronogramas/Cronograma_Administracion_Semana10_IUTECP.docx
+++ b/amaal/cronogramas/Cronograma_Administracion_Semana10_IUTECP.docx
@@ -133,7 +133,7 @@
           <w:rFonts w:ascii="Times New Roman" w:hAnsi="Times New Roman"/>
           <w:sz w:val="24"/>
         </w:rPr>
-        <w:t>Alrifaaie Amaal |  C.I.: 31.985.792</w:t>
+        <w:t>Alrifaai Alrifaaie, Amaal |  C.I.: 31.985.792</w:t>
       </w:r>
     </w:p>
     <w:p>
@@ -942,7 +942,7 @@
               </w:rPr>
               <w:t>Firma del Pasante:</w:t>
               <w:br/>
-              <w:t>Alrifaaie Amaal |  C.I.: 31.985.792</w:t>
+              <w:t>Alrifaai Alrifaaie, Amaal |  C.I.: 31.985.792</w:t>
             </w:r>
           </w:p>
         </w:tc>

</xml_diff>